<commit_message>
fix: GitHub Pages URL 반영 및 flappy-bird 사실관계 정정
- GitHub Pages 배포 URL을 이력서·제출 확인 문서에 기재
- flappy-bird 프로젝트를 실제(AI 활용 바이브코딩, 1일, SevMerge 이후)에 맞게
  이력서/경력기술서/자기소개서/사이트 전반에서 "독학" 서술을 정정
- 제출_확인방법.md의 AI 판단 3번째 항목(AI 제안을 따르지 않은 일) 작성
- 체크리스트 최신 상태로 갱신

Co-Authored-By: Claude Sonnet 5 <noreply@anthropic.com>
</commit_message>
<xml_diff>
--- a/documents/경력기술서_이학산.docx
+++ b/documents/경력기술서_이학산.docx
@@ -200,7 +200,7 @@
         <w:pStyle w:val="Heading2"/>
       </w:pPr>
       <w:r>
-        <w:t>5. flappy-bird — 독학 게임 프로젝트 (시기 미상, SevMerge 이전)</w:t>
+        <w:t>5. flappy-bird — AI 활용 게임 프로젝트 (제작 기간: 1일, SevMerge 이후)</w:t>
       </w:r>
     </w:p>
     <w:p>
@@ -212,7 +212,7 @@
         <w:t>해당 능력</w:t>
       </w:r>
       <w:r>
-        <w:t>: 자기동기력</w:t>
+        <w:t>: 새로운 도구 활용력</w:t>
       </w:r>
     </w:p>
     <w:p>
@@ -220,7 +220,7 @@
         <w:pStyle w:val="ListBullet"/>
       </w:pPr>
       <w:r>
-        <w:t>**상황(S)**: 배워 본 적 없는 게임 프로그래밍을 혼자 힘으로 시도.</w:t>
+        <w:t>**상황(S)**: 게임 프로그래밍 경험이 없는 상태에서, AI 도구를 활용해 하루 만에 결과물을 만들어보기로 함.</w:t>
       </w:r>
     </w:p>
     <w:p>
@@ -228,7 +228,7 @@
         <w:pStyle w:val="ListBullet"/>
       </w:pPr>
       <w:r>
-        <w:t>**행동(A)**: 온라인 강의·책으로 기초를 독학하고, 발생하는 오류를 혼자 힘으로 하나씩 해결하며 완성까지 밀어붙임.</w:t>
+        <w:t>**행동(A)**: AI에게 코드 생성을 요청하고, 실행 결과를 직접 확인하며 원하는 동작이 나올 때까지 요청과 코드를 반복적으로 조정.</w:t>
       </w:r>
     </w:p>
     <w:p>
@@ -236,7 +236,7 @@
         <w:pStyle w:val="ListBullet"/>
       </w:pPr>
       <w:r>
-        <w:t>**결과(R)**: 첫 게임을 완성해 공개. 이 경험이 이후 SevMerge 등 더 규모 있는 프로젝트에 도전하는 밑거름이 됨. github.com/LeeHakSan/flappy-bird</w:t>
+        <w:t>**결과(R)**: 하루 만에 첫 게임을 완성해 공개. AI 도구를 빠르게 익혀 활용하는 경험을 얻음. github.com/LeeHakSan/flappy-bird</w:t>
       </w:r>
     </w:p>
     <w:p>
@@ -252,7 +252,7 @@
         <w:pStyle w:val="ListBullet"/>
       </w:pPr>
       <w:r>
-        <w:t>flappy-bird의 정확한 제작 기간</w:t>
+        <w:t>(없음 — flappy-bird 제작 기간 확인 완료: AI 활용, 1일)</w:t>
       </w:r>
     </w:p>
     <w:sectPr>

</xml_diff>